<commit_message>
Kapitel Listen erweitern: 3 -> 6 Lektionen
- 04-verbinden-und-slicing (NEU): Listen mit + verketten, Slicing
  (Parallele zu Strings)
- 05-suchen-und-entfernen (NEU): in, .index(), .count(), .remove()
- 06-listen-anwenden (NEU, Capstone): kombiniert while+Index (aus dem
  Schleifen-Kapitel) mit Listenzugriff fuer zwei anspruchsvollere aber
  deterministisch pruefbare Aufgaben - fehlende Zahl per Summenformel-
  Trick finden, Duplikat per "gesehen"-Liste finden. Echte
  Zufallszahlen-Aufgaben (Lotto) aus dem Material wurden bewusst NICHT
  uebernommen, da der App-Evaluator nur deterministische Tests
  unterstuetzt (output/var/func, kein Property-Check).

Arbeitsblatt fuer Kapitel 09 neu erzeugt. Regressionstest ueber alle
15 Kapitel: 124 Code-Tests, 0 echte Fehler (1 Fehlalarm durch einen
Prosa-Hint ohne reinen Code, kein Bug).

Co-Authored-By: Claude Sonnet 5 <noreply@anthropic.com>
</commit_message>
<xml_diff>
--- a/arbeitsblaetter/Kapitel_09_Listen_Information_Aufgabenblatt.docx
+++ b/arbeitsblaetter/Kapitel_09_Listen_Information_Aufgabenblatt.docx
@@ -2101,6 +2101,2468 @@
         <w:t xml:space="preserve"> Zeile ohne Index gelingt. 😊</w:t>
       </w:r>
     </w:p>
+    <w:p>
+      <w:pPr>
+        <w:spacing w:before="320" w:after="120"/>
+        <w:pBdr>
+          <w:bottom w:val="single" w:sz="8" w:space="4" w:color="009FE3"/>
+        </w:pBdr>
+        <w:keepNext/>
+      </w:pPr>
+      <w:r>
+        <w:rPr>
+          <w:rFonts w:ascii="Arial" w:hAnsi="Arial" w:eastAsia="Arial"/>
+          <w:b/>
+          <w:i w:val="0"/>
+          <w:color w:val="00344D"/>
+          <w:sz w:val="30"/>
+        </w:rPr>
+        <w:t>Listen verbinden und Slicing</w:t>
+      </w:r>
+    </w:p>
+    <w:p>
+      <w:pPr>
+        <w:spacing w:after="160"/>
+        <w:keepNext/>
+      </w:pPr>
+      <w:r>
+        <w:rPr>
+          <w:rFonts w:ascii="Arial" w:hAnsi="Arial" w:eastAsia="Arial"/>
+          <w:b w:val="0"/>
+          <w:i w:val="0"/>
+          <w:sz w:val="22"/>
+        </w:rPr>
+        <w:t xml:space="preserve">Mit </w:t>
+      </w:r>
+      <w:r>
+        <w:rPr>
+          <w:rFonts w:ascii="Consolas" w:hAnsi="Consolas" w:eastAsia="Consolas"/>
+          <w:b/>
+          <w:i w:val="0"/>
+          <w:color w:val="00344D"/>
+          <w:sz w:val="21"/>
+        </w:rPr>
+        <w:t>+</w:t>
+      </w:r>
+      <w:r>
+        <w:rPr>
+          <w:rFonts w:ascii="Arial" w:hAnsi="Arial" w:eastAsia="Arial"/>
+          <w:b w:val="0"/>
+          <w:i w:val="0"/>
+          <w:sz w:val="22"/>
+        </w:rPr>
+        <w:t xml:space="preserve"> kannst du zwei Listen zu einer </w:t>
+      </w:r>
+      <w:r>
+        <w:rPr>
+          <w:rFonts w:ascii="Arial" w:hAnsi="Arial" w:eastAsia="Arial"/>
+          <w:b/>
+          <w:i w:val="0"/>
+          <w:color w:val="00344D"/>
+          <w:sz w:val="22"/>
+        </w:rPr>
+        <w:t>neuen</w:t>
+      </w:r>
+      <w:r>
+        <w:rPr>
+          <w:rFonts w:ascii="Arial" w:hAnsi="Arial" w:eastAsia="Arial"/>
+          <w:b w:val="0"/>
+          <w:i w:val="0"/>
+          <w:sz w:val="22"/>
+        </w:rPr>
+        <w:t xml:space="preserve"> Liste </w:t>
+      </w:r>
+      <w:r>
+        <w:rPr>
+          <w:rFonts w:ascii="Arial" w:hAnsi="Arial" w:eastAsia="Arial"/>
+          <w:b/>
+          <w:i w:val="0"/>
+          <w:color w:val="00344D"/>
+          <w:sz w:val="22"/>
+        </w:rPr>
+        <w:t>verbinden</w:t>
+      </w:r>
+      <w:r>
+        <w:rPr>
+          <w:rFonts w:ascii="Arial" w:hAnsi="Arial" w:eastAsia="Arial"/>
+          <w:b w:val="0"/>
+          <w:i w:val="0"/>
+          <w:sz w:val="22"/>
+        </w:rPr>
+        <w:t xml:space="preserve"> (verketten) – genau wie du es von Strings kennst.</w:t>
+      </w:r>
+    </w:p>
+    <w:p>
+      <w:pPr>
+        <w:spacing w:after="160"/>
+        <w:keepNext/>
+      </w:pPr>
+      <w:r>
+        <w:rPr>
+          <w:rFonts w:ascii="Arial" w:hAnsi="Arial" w:eastAsia="Arial"/>
+          <w:b w:val="0"/>
+          <w:i w:val="0"/>
+          <w:sz w:val="22"/>
+        </w:rPr>
+        <w:t>+ hängt liste2 hinten an liste1 an:</w:t>
+      </w:r>
+    </w:p>
+    <w:p>
+      <w:pPr>
+        <w:spacing w:after="40"/>
+        <w:keepNext/>
+      </w:pPr>
+      <w:r>
+        <w:rPr>
+          <w:rFonts w:ascii="Arial" w:hAnsi="Arial" w:eastAsia="Arial"/>
+          <w:b w:val="0"/>
+          <w:i/>
+          <w:color w:val="6E7B85"/>
+          <w:sz w:val="20"/>
+        </w:rPr>
+        <w:t>Beispiel</w:t>
+      </w:r>
+    </w:p>
+    <w:p>
+      <w:pPr>
+        <w:spacing w:after="200"/>
+        <w:shd w:val="clear" w:color="auto" w:fill="F2F5F7"/>
+      </w:pPr>
+      <w:r>
+        <w:rPr>
+          <w:rFonts w:ascii="Consolas" w:hAnsi="Consolas" w:eastAsia="Consolas"/>
+          <w:b w:val="0"/>
+          <w:i w:val="0"/>
+          <w:color w:val="00344D"/>
+          <w:sz w:val="21"/>
+        </w:rPr>
+        <w:t>liste1 = [1, 2, 3]</w:t>
+      </w:r>
+      <w:r>
+        <w:br/>
+      </w:r>
+      <w:r>
+        <w:rPr>
+          <w:rFonts w:ascii="Consolas" w:hAnsi="Consolas" w:eastAsia="Consolas"/>
+          <w:b w:val="0"/>
+          <w:i w:val="0"/>
+          <w:color w:val="00344D"/>
+          <w:sz w:val="21"/>
+        </w:rPr>
+        <w:t>liste2 = [4, 5, 6]</w:t>
+      </w:r>
+      <w:r>
+        <w:br/>
+      </w:r>
+      <w:r>
+        <w:rPr>
+          <w:rFonts w:ascii="Consolas" w:hAnsi="Consolas" w:eastAsia="Consolas"/>
+          <w:b w:val="0"/>
+          <w:i w:val="0"/>
+          <w:color w:val="00344D"/>
+          <w:sz w:val="21"/>
+        </w:rPr>
+        <w:t>kombiniert = liste1 + liste2</w:t>
+      </w:r>
+      <w:r>
+        <w:br/>
+      </w:r>
+      <w:r>
+        <w:rPr>
+          <w:rFonts w:ascii="Consolas" w:hAnsi="Consolas" w:eastAsia="Consolas"/>
+          <w:b w:val="0"/>
+          <w:i w:val="0"/>
+          <w:color w:val="00344D"/>
+          <w:sz w:val="21"/>
+        </w:rPr>
+        <w:t>print(kombiniert)</w:t>
+      </w:r>
+    </w:p>
+    <w:p>
+      <w:pPr>
+        <w:spacing w:after="160"/>
+        <w:keepNext/>
+      </w:pPr>
+      <w:r>
+        <w:rPr>
+          <w:rFonts w:ascii="Arial" w:hAnsi="Arial" w:eastAsia="Arial"/>
+          <w:b w:val="0"/>
+          <w:i w:val="0"/>
+          <w:sz w:val="22"/>
+        </w:rPr>
+        <w:t xml:space="preserve">Auch </w:t>
+      </w:r>
+      <w:r>
+        <w:rPr>
+          <w:rFonts w:ascii="Arial" w:hAnsi="Arial" w:eastAsia="Arial"/>
+          <w:b/>
+          <w:i w:val="0"/>
+          <w:color w:val="00344D"/>
+          <w:sz w:val="22"/>
+        </w:rPr>
+        <w:t>Slicing</w:t>
+      </w:r>
+      <w:r>
+        <w:rPr>
+          <w:rFonts w:ascii="Arial" w:hAnsi="Arial" w:eastAsia="Arial"/>
+          <w:b w:val="0"/>
+          <w:i w:val="0"/>
+          <w:sz w:val="22"/>
+        </w:rPr>
+        <w:t xml:space="preserve"> funktioniert bei Listen genauso wie bei Strings: </w:t>
+      </w:r>
+      <w:r>
+        <w:rPr>
+          <w:rFonts w:ascii="Consolas" w:hAnsi="Consolas" w:eastAsia="Consolas"/>
+          <w:b/>
+          <w:i w:val="0"/>
+          <w:color w:val="00344D"/>
+          <w:sz w:val="21"/>
+        </w:rPr>
+        <w:t>liste[start:ende]</w:t>
+      </w:r>
+      <w:r>
+        <w:rPr>
+          <w:rFonts w:ascii="Arial" w:hAnsi="Arial" w:eastAsia="Arial"/>
+          <w:b w:val="0"/>
+          <w:i w:val="0"/>
+          <w:sz w:val="22"/>
+        </w:rPr>
+        <w:t xml:space="preserve"> gibt eine </w:t>
+      </w:r>
+      <w:r>
+        <w:rPr>
+          <w:rFonts w:ascii="Arial" w:hAnsi="Arial" w:eastAsia="Arial"/>
+          <w:b/>
+          <w:i w:val="0"/>
+          <w:color w:val="00344D"/>
+          <w:sz w:val="22"/>
+        </w:rPr>
+        <w:t>neue Teilliste</w:t>
+      </w:r>
+      <w:r>
+        <w:rPr>
+          <w:rFonts w:ascii="Arial" w:hAnsi="Arial" w:eastAsia="Arial"/>
+          <w:b w:val="0"/>
+          <w:i w:val="0"/>
+          <w:sz w:val="22"/>
+        </w:rPr>
+        <w:t xml:space="preserve"> zurück – der </w:t>
+      </w:r>
+      <w:r>
+        <w:rPr>
+          <w:rFonts w:ascii="Consolas" w:hAnsi="Consolas" w:eastAsia="Consolas"/>
+          <w:b w:val="0"/>
+          <w:i w:val="0"/>
+          <w:sz w:val="21"/>
+        </w:rPr>
+        <w:t>ende</w:t>
+      </w:r>
+      <w:r>
+        <w:rPr>
+          <w:rFonts w:ascii="Arial" w:hAnsi="Arial" w:eastAsia="Arial"/>
+          <w:b w:val="0"/>
+          <w:i w:val="0"/>
+          <w:sz w:val="22"/>
+        </w:rPr>
+        <w:t xml:space="preserve">-Index ist wieder </w:t>
+      </w:r>
+      <w:r>
+        <w:rPr>
+          <w:rFonts w:ascii="Arial" w:hAnsi="Arial" w:eastAsia="Arial"/>
+          <w:b/>
+          <w:i w:val="0"/>
+          <w:color w:val="00344D"/>
+          <w:sz w:val="22"/>
+        </w:rPr>
+        <w:t>ausgeschlossen</w:t>
+      </w:r>
+      <w:r>
+        <w:rPr>
+          <w:rFonts w:ascii="Arial" w:hAnsi="Arial" w:eastAsia="Arial"/>
+          <w:b w:val="0"/>
+          <w:i w:val="0"/>
+          <w:sz w:val="22"/>
+        </w:rPr>
+        <w:t>.</w:t>
+      </w:r>
+    </w:p>
+    <w:p>
+      <w:pPr>
+        <w:spacing w:after="160"/>
+        <w:keepNext/>
+      </w:pPr>
+      <w:r>
+        <w:rPr>
+          <w:rFonts w:ascii="Arial" w:hAnsi="Arial" w:eastAsia="Arial"/>
+          <w:b w:val="0"/>
+          <w:i w:val="0"/>
+          <w:sz w:val="22"/>
+        </w:rPr>
+        <w:t>liste[1:4] holt die Elemente an den Indizes 1, 2 und 3:</w:t>
+      </w:r>
+    </w:p>
+    <w:p>
+      <w:pPr>
+        <w:spacing w:after="40"/>
+        <w:keepNext/>
+      </w:pPr>
+      <w:r>
+        <w:rPr>
+          <w:rFonts w:ascii="Arial" w:hAnsi="Arial" w:eastAsia="Arial"/>
+          <w:b w:val="0"/>
+          <w:i/>
+          <w:color w:val="6E7B85"/>
+          <w:sz w:val="20"/>
+        </w:rPr>
+        <w:t>Beispiel</w:t>
+      </w:r>
+    </w:p>
+    <w:p>
+      <w:pPr>
+        <w:spacing w:after="200"/>
+        <w:shd w:val="clear" w:color="auto" w:fill="F2F5F7"/>
+      </w:pPr>
+      <w:r>
+        <w:rPr>
+          <w:rFonts w:ascii="Consolas" w:hAnsi="Consolas" w:eastAsia="Consolas"/>
+          <w:b w:val="0"/>
+          <w:i w:val="0"/>
+          <w:color w:val="00344D"/>
+          <w:sz w:val="21"/>
+        </w:rPr>
+        <w:t>zahlen = [10, 20, 30, 40, 50]</w:t>
+      </w:r>
+      <w:r>
+        <w:br/>
+      </w:r>
+      <w:r>
+        <w:rPr>
+          <w:rFonts w:ascii="Consolas" w:hAnsi="Consolas" w:eastAsia="Consolas"/>
+          <w:b w:val="0"/>
+          <w:i w:val="0"/>
+          <w:color w:val="00344D"/>
+          <w:sz w:val="21"/>
+        </w:rPr>
+        <w:t>teil = zahlen[1:4]</w:t>
+      </w:r>
+      <w:r>
+        <w:br/>
+      </w:r>
+      <w:r>
+        <w:rPr>
+          <w:rFonts w:ascii="Consolas" w:hAnsi="Consolas" w:eastAsia="Consolas"/>
+          <w:b w:val="0"/>
+          <w:i w:val="0"/>
+          <w:color w:val="00344D"/>
+          <w:sz w:val="21"/>
+        </w:rPr>
+        <w:t>print(teil)</w:t>
+      </w:r>
+    </w:p>
+    <w:tbl>
+      <w:tblPr>
+        <w:tblW w:type="auto" w:w="0"/>
+        <w:tblLayout w:type="autofit"/>
+        <w:tblLook w:firstColumn="1" w:firstRow="1" w:lastColumn="0" w:lastRow="0" w:noHBand="0" w:noVBand="1" w:val="04A0"/>
+        <w:tblBorders>
+          <w:top w:val="single" w:sz="8" w:space="0" w:color="009FE3"/>
+          <w:left w:val="single" w:sz="8" w:space="0" w:color="009FE3"/>
+          <w:bottom w:val="single" w:sz="8" w:space="0" w:color="009FE3"/>
+          <w:right w:val="single" w:sz="8" w:space="0" w:color="009FE3"/>
+          <w:insideH w:val="single" w:sz="8" w:space="0" w:color="009FE3"/>
+          <w:insideV w:val="single" w:sz="8" w:space="0" w:color="009FE3"/>
+        </w:tblBorders>
+      </w:tblPr>
+      <w:tblGrid>
+        <w:gridCol w:w="9648"/>
+      </w:tblGrid>
+      <w:tr>
+        <w:trPr>
+          <w:cantSplit/>
+        </w:trPr>
+        <w:tc>
+          <w:tcPr>
+            <w:tcW w:type="dxa" w:w="9648"/>
+            <w:shd w:val="clear" w:color="auto" w:fill="EAF6FC"/>
+            <w:tcMar>
+              <w:top w:w="80" w:type="dxa"/>
+              <w:start w:w="120" w:type="dxa"/>
+              <w:bottom w:w="80" w:type="dxa"/>
+              <w:end w:w="120" w:type="dxa"/>
+            </w:tcMar>
+          </w:tcPr>
+          <w:p>
+            <w:r>
+              <w:rPr>
+                <w:rFonts w:ascii="Arial" w:hAnsi="Arial" w:eastAsia="Arial"/>
+                <w:b/>
+                <w:i w:val="0"/>
+                <w:color w:val="00344D"/>
+                <w:sz w:val="22"/>
+              </w:rPr>
+              <w:t xml:space="preserve">Aufgabe 7: </w:t>
+            </w:r>
+            <w:r>
+              <w:rPr>
+                <w:rFonts w:ascii="Arial" w:hAnsi="Arial" w:eastAsia="Arial"/>
+                <w:b/>
+                <w:i w:val="0"/>
+                <w:color w:val="00344D"/>
+                <w:sz w:val="22"/>
+              </w:rPr>
+              <w:t xml:space="preserve">Was gibt </w:t>
+            </w:r>
+            <w:r>
+              <w:rPr>
+                <w:rFonts w:ascii="Consolas" w:hAnsi="Consolas" w:eastAsia="Consolas"/>
+                <w:b/>
+                <w:i w:val="0"/>
+                <w:color w:val="00344D"/>
+                <w:sz w:val="21"/>
+              </w:rPr>
+              <w:t>[1, 2, 3] + [4, 5]</w:t>
+            </w:r>
+            <w:r>
+              <w:rPr>
+                <w:rFonts w:ascii="Arial" w:hAnsi="Arial" w:eastAsia="Arial"/>
+                <w:b/>
+                <w:i w:val="0"/>
+                <w:color w:val="00344D"/>
+                <w:sz w:val="22"/>
+              </w:rPr>
+              <w:t xml:space="preserve"> zurück?</w:t>
+            </w:r>
+          </w:p>
+          <w:p/>
+          <w:p>
+            <w:r>
+              <w:rPr>
+                <w:rFonts w:ascii="Arial" w:hAnsi="Arial" w:eastAsia="Arial"/>
+                <w:b w:val="0"/>
+                <w:i w:val="0"/>
+                <w:sz w:val="22"/>
+              </w:rPr>
+              <w:t xml:space="preserve">☐  a)  </w:t>
+            </w:r>
+            <w:r>
+              <w:rPr>
+                <w:rFonts w:ascii="Arial" w:hAnsi="Arial" w:eastAsia="Arial"/>
+                <w:b w:val="0"/>
+                <w:i w:val="0"/>
+                <w:sz w:val="22"/>
+              </w:rPr>
+              <w:t>[5, 7]</w:t>
+            </w:r>
+          </w:p>
+          <w:p>
+            <w:r>
+              <w:rPr>
+                <w:rFonts w:ascii="Arial" w:hAnsi="Arial" w:eastAsia="Arial"/>
+                <w:b w:val="0"/>
+                <w:i w:val="0"/>
+                <w:sz w:val="22"/>
+              </w:rPr>
+              <w:t xml:space="preserve">☐  b)  </w:t>
+            </w:r>
+            <w:r>
+              <w:rPr>
+                <w:rFonts w:ascii="Arial" w:hAnsi="Arial" w:eastAsia="Arial"/>
+                <w:b w:val="0"/>
+                <w:i w:val="0"/>
+                <w:sz w:val="22"/>
+              </w:rPr>
+              <w:t>[1, 2, 3, 4, 5]</w:t>
+            </w:r>
+          </w:p>
+          <w:p>
+            <w:r>
+              <w:rPr>
+                <w:rFonts w:ascii="Arial" w:hAnsi="Arial" w:eastAsia="Arial"/>
+                <w:b w:val="0"/>
+                <w:i w:val="0"/>
+                <w:sz w:val="22"/>
+              </w:rPr>
+              <w:t xml:space="preserve">☐  c)  </w:t>
+            </w:r>
+            <w:r>
+              <w:rPr>
+                <w:rFonts w:ascii="Arial" w:hAnsi="Arial" w:eastAsia="Arial"/>
+                <w:b w:val="0"/>
+                <w:i w:val="0"/>
+                <w:sz w:val="22"/>
+              </w:rPr>
+              <w:t>Einen Fehler</w:t>
+            </w:r>
+          </w:p>
+        </w:tc>
+      </w:tr>
+    </w:tbl>
+    <w:tbl>
+      <w:tblPr>
+        <w:tblW w:type="auto" w:w="0"/>
+        <w:tblLayout w:type="autofit"/>
+        <w:tblLook w:firstColumn="1" w:firstRow="1" w:lastColumn="0" w:lastRow="0" w:noHBand="0" w:noVBand="1" w:val="04A0"/>
+        <w:tblBorders>
+          <w:top w:val="single" w:sz="8" w:space="0" w:color="009FE3"/>
+          <w:left w:val="single" w:sz="8" w:space="0" w:color="009FE3"/>
+          <w:bottom w:val="single" w:sz="8" w:space="0" w:color="009FE3"/>
+          <w:right w:val="single" w:sz="8" w:space="0" w:color="009FE3"/>
+          <w:insideH w:val="single" w:sz="8" w:space="0" w:color="009FE3"/>
+          <w:insideV w:val="single" w:sz="8" w:space="0" w:color="009FE3"/>
+        </w:tblBorders>
+      </w:tblPr>
+      <w:tblGrid>
+        <w:gridCol w:w="9648"/>
+      </w:tblGrid>
+      <w:tr>
+        <w:trPr>
+          <w:cantSplit/>
+        </w:trPr>
+        <w:tc>
+          <w:tcPr>
+            <w:tcW w:type="dxa" w:w="9648"/>
+            <w:shd w:val="clear" w:color="auto" w:fill="EAF6FC"/>
+            <w:tcMar>
+              <w:top w:w="80" w:type="dxa"/>
+              <w:start w:w="120" w:type="dxa"/>
+              <w:bottom w:w="80" w:type="dxa"/>
+              <w:end w:w="120" w:type="dxa"/>
+            </w:tcMar>
+          </w:tcPr>
+          <w:p>
+            <w:r>
+              <w:rPr>
+                <w:rFonts w:ascii="Arial" w:hAnsi="Arial" w:eastAsia="Arial"/>
+                <w:b/>
+                <w:i w:val="0"/>
+                <w:color w:val="00344D"/>
+                <w:sz w:val="22"/>
+              </w:rPr>
+              <w:t xml:space="preserve">Aufgabe 8: </w:t>
+            </w:r>
+            <w:r>
+              <w:rPr>
+                <w:rFonts w:ascii="Arial" w:hAnsi="Arial" w:eastAsia="Arial"/>
+                <w:b/>
+                <w:i w:val="0"/>
+                <w:color w:val="00344D"/>
+                <w:sz w:val="22"/>
+              </w:rPr>
+              <w:t xml:space="preserve">In </w:t>
+            </w:r>
+            <w:r>
+              <w:rPr>
+                <w:rFonts w:ascii="Consolas" w:hAnsi="Consolas" w:eastAsia="Consolas"/>
+                <w:b/>
+                <w:i w:val="0"/>
+                <w:color w:val="00344D"/>
+                <w:sz w:val="21"/>
+              </w:rPr>
+              <w:t>gruppe_a</w:t>
+            </w:r>
+            <w:r>
+              <w:rPr>
+                <w:rFonts w:ascii="Arial" w:hAnsi="Arial" w:eastAsia="Arial"/>
+                <w:b/>
+                <w:i w:val="0"/>
+                <w:color w:val="00344D"/>
+                <w:sz w:val="22"/>
+              </w:rPr>
+              <w:t xml:space="preserve"> und </w:t>
+            </w:r>
+            <w:r>
+              <w:rPr>
+                <w:rFonts w:ascii="Consolas" w:hAnsi="Consolas" w:eastAsia="Consolas"/>
+                <w:b/>
+                <w:i w:val="0"/>
+                <w:color w:val="00344D"/>
+                <w:sz w:val="21"/>
+              </w:rPr>
+              <w:t>gruppe_b</w:t>
+            </w:r>
+            <w:r>
+              <w:rPr>
+                <w:rFonts w:ascii="Arial" w:hAnsi="Arial" w:eastAsia="Arial"/>
+                <w:b/>
+                <w:i w:val="0"/>
+                <w:color w:val="00344D"/>
+                <w:sz w:val="22"/>
+              </w:rPr>
+              <w:t xml:space="preserve"> stehen zwei Listen. Verbinde sie mit </w:t>
+            </w:r>
+            <w:r>
+              <w:rPr>
+                <w:rFonts w:ascii="Consolas" w:hAnsi="Consolas" w:eastAsia="Consolas"/>
+                <w:b/>
+                <w:i w:val="0"/>
+                <w:color w:val="00344D"/>
+                <w:sz w:val="21"/>
+              </w:rPr>
+              <w:t>+</w:t>
+            </w:r>
+            <w:r>
+              <w:rPr>
+                <w:rFonts w:ascii="Arial" w:hAnsi="Arial" w:eastAsia="Arial"/>
+                <w:b/>
+                <w:i w:val="0"/>
+                <w:color w:val="00344D"/>
+                <w:sz w:val="22"/>
+              </w:rPr>
+              <w:t xml:space="preserve"> zu </w:t>
+            </w:r>
+            <w:r>
+              <w:rPr>
+                <w:rFonts w:ascii="Consolas" w:hAnsi="Consolas" w:eastAsia="Consolas"/>
+                <w:b/>
+                <w:i w:val="0"/>
+                <w:color w:val="00344D"/>
+                <w:sz w:val="21"/>
+              </w:rPr>
+              <w:t>alle</w:t>
+            </w:r>
+            <w:r>
+              <w:rPr>
+                <w:rFonts w:ascii="Arial" w:hAnsi="Arial" w:eastAsia="Arial"/>
+                <w:b/>
+                <w:i w:val="0"/>
+                <w:color w:val="00344D"/>
+                <w:sz w:val="22"/>
+              </w:rPr>
+              <w:t xml:space="preserve">, gib </w:t>
+            </w:r>
+            <w:r>
+              <w:rPr>
+                <w:rFonts w:ascii="Consolas" w:hAnsi="Consolas" w:eastAsia="Consolas"/>
+                <w:b/>
+                <w:i w:val="0"/>
+                <w:color w:val="00344D"/>
+                <w:sz w:val="21"/>
+              </w:rPr>
+              <w:t>alle</w:t>
+            </w:r>
+            <w:r>
+              <w:rPr>
+                <w:rFonts w:ascii="Arial" w:hAnsi="Arial" w:eastAsia="Arial"/>
+                <w:b/>
+                <w:i w:val="0"/>
+                <w:color w:val="00344D"/>
+                <w:sz w:val="22"/>
+              </w:rPr>
+              <w:t xml:space="preserve"> aus. Gib danach mit Slicing nur die letzten zwei Namen von </w:t>
+            </w:r>
+            <w:r>
+              <w:rPr>
+                <w:rFonts w:ascii="Consolas" w:hAnsi="Consolas" w:eastAsia="Consolas"/>
+                <w:b/>
+                <w:i w:val="0"/>
+                <w:color w:val="00344D"/>
+                <w:sz w:val="21"/>
+              </w:rPr>
+              <w:t>alle</w:t>
+            </w:r>
+            <w:r>
+              <w:rPr>
+                <w:rFonts w:ascii="Arial" w:hAnsi="Arial" w:eastAsia="Arial"/>
+                <w:b/>
+                <w:i w:val="0"/>
+                <w:color w:val="00344D"/>
+                <w:sz w:val="22"/>
+              </w:rPr>
+              <w:t xml:space="preserve"> aus (</w:t>
+            </w:r>
+            <w:r>
+              <w:rPr>
+                <w:rFonts w:ascii="Consolas" w:hAnsi="Consolas" w:eastAsia="Consolas"/>
+                <w:b/>
+                <w:i w:val="0"/>
+                <w:color w:val="00344D"/>
+                <w:sz w:val="21"/>
+              </w:rPr>
+              <w:t>alle[-2:]</w:t>
+            </w:r>
+            <w:r>
+              <w:rPr>
+                <w:rFonts w:ascii="Arial" w:hAnsi="Arial" w:eastAsia="Arial"/>
+                <w:b/>
+                <w:i w:val="0"/>
+                <w:color w:val="00344D"/>
+                <w:sz w:val="22"/>
+              </w:rPr>
+              <w:t>).</w:t>
+            </w:r>
+          </w:p>
+          <w:p>
+            <w:r>
+              <w:rPr>
+                <w:rFonts w:ascii="Consolas" w:hAnsi="Consolas" w:eastAsia="Consolas"/>
+                <w:b w:val="0"/>
+                <w:i/>
+                <w:color w:val="6E7B85"/>
+                <w:sz w:val="20"/>
+              </w:rPr>
+              <w:t>gruppe_a = ["Ada", "Alan"]</w:t>
+            </w:r>
+            <w:r>
+              <w:br/>
+            </w:r>
+            <w:r>
+              <w:rPr>
+                <w:rFonts w:ascii="Consolas" w:hAnsi="Consolas" w:eastAsia="Consolas"/>
+                <w:b w:val="0"/>
+                <w:i/>
+                <w:color w:val="6E7B85"/>
+                <w:sz w:val="20"/>
+              </w:rPr>
+              <w:t>gruppe_b = ["Grace", "Linus", "Tim"]</w:t>
+            </w:r>
+          </w:p>
+          <w:p>
+            <w:r>
+              <w:rPr>
+                <w:rFonts w:ascii="Arial" w:hAnsi="Arial" w:eastAsia="Arial"/>
+                <w:b w:val="0"/>
+                <w:i/>
+                <w:color w:val="6E7B85"/>
+                <w:sz w:val="19"/>
+              </w:rPr>
+              <w:t>Dein Code:</w:t>
+            </w:r>
+          </w:p>
+          <w:p/>
+          <w:p/>
+          <w:p/>
+        </w:tc>
+      </w:tr>
+    </w:tbl>
+    <w:p>
+      <w:pPr>
+        <w:spacing w:before="320" w:after="120"/>
+        <w:pBdr>
+          <w:bottom w:val="single" w:sz="8" w:space="4" w:color="009FE3"/>
+        </w:pBdr>
+        <w:keepNext/>
+      </w:pPr>
+      <w:r>
+        <w:rPr>
+          <w:rFonts w:ascii="Arial" w:hAnsi="Arial" w:eastAsia="Arial"/>
+          <w:b/>
+          <w:i w:val="0"/>
+          <w:color w:val="00344D"/>
+          <w:sz w:val="30"/>
+        </w:rPr>
+        <w:t>Suchen und Entfernen</w:t>
+      </w:r>
+    </w:p>
+    <w:p>
+      <w:pPr>
+        <w:spacing w:after="160"/>
+        <w:keepNext/>
+      </w:pPr>
+      <w:r>
+        <w:rPr>
+          <w:rFonts w:ascii="Arial" w:hAnsi="Arial" w:eastAsia="Arial"/>
+          <w:b w:val="0"/>
+          <w:i w:val="0"/>
+          <w:sz w:val="22"/>
+        </w:rPr>
+        <w:t xml:space="preserve">Du kennst </w:t>
+      </w:r>
+      <w:r>
+        <w:rPr>
+          <w:rFonts w:ascii="Consolas" w:hAnsi="Consolas" w:eastAsia="Consolas"/>
+          <w:b/>
+          <w:i w:val="0"/>
+          <w:color w:val="00344D"/>
+          <w:sz w:val="21"/>
+        </w:rPr>
+        <w:t>in</w:t>
+      </w:r>
+      <w:r>
+        <w:rPr>
+          <w:rFonts w:ascii="Arial" w:hAnsi="Arial" w:eastAsia="Arial"/>
+          <w:b w:val="0"/>
+          <w:i w:val="0"/>
+          <w:sz w:val="22"/>
+        </w:rPr>
+        <w:t xml:space="preserve"> schon von Strings – bei Listen funktioniert es genauso: Es prüft, ob ein Wert </w:t>
+      </w:r>
+      <w:r>
+        <w:rPr>
+          <w:rFonts w:ascii="Arial" w:hAnsi="Arial" w:eastAsia="Arial"/>
+          <w:b/>
+          <w:i w:val="0"/>
+          <w:color w:val="00344D"/>
+          <w:sz w:val="22"/>
+        </w:rPr>
+        <w:t>enthalten</w:t>
+      </w:r>
+      <w:r>
+        <w:rPr>
+          <w:rFonts w:ascii="Arial" w:hAnsi="Arial" w:eastAsia="Arial"/>
+          <w:b w:val="0"/>
+          <w:i w:val="0"/>
+          <w:sz w:val="22"/>
+        </w:rPr>
+        <w:t xml:space="preserve"> ist, und liefert </w:t>
+      </w:r>
+      <w:r>
+        <w:rPr>
+          <w:rFonts w:ascii="Consolas" w:hAnsi="Consolas" w:eastAsia="Consolas"/>
+          <w:b w:val="0"/>
+          <w:i w:val="0"/>
+          <w:sz w:val="21"/>
+        </w:rPr>
+        <w:t>True</w:t>
+      </w:r>
+      <w:r>
+        <w:rPr>
+          <w:rFonts w:ascii="Arial" w:hAnsi="Arial" w:eastAsia="Arial"/>
+          <w:b w:val="0"/>
+          <w:i w:val="0"/>
+          <w:sz w:val="22"/>
+        </w:rPr>
+        <w:t xml:space="preserve"> oder </w:t>
+      </w:r>
+      <w:r>
+        <w:rPr>
+          <w:rFonts w:ascii="Consolas" w:hAnsi="Consolas" w:eastAsia="Consolas"/>
+          <w:b w:val="0"/>
+          <w:i w:val="0"/>
+          <w:sz w:val="21"/>
+        </w:rPr>
+        <w:t>False</w:t>
+      </w:r>
+      <w:r>
+        <w:rPr>
+          <w:rFonts w:ascii="Arial" w:hAnsi="Arial" w:eastAsia="Arial"/>
+          <w:b w:val="0"/>
+          <w:i w:val="0"/>
+          <w:sz w:val="22"/>
+        </w:rPr>
+        <w:t>.</w:t>
+      </w:r>
+    </w:p>
+    <w:p>
+      <w:pPr>
+        <w:spacing w:after="160"/>
+        <w:keepNext/>
+      </w:pPr>
+      <w:r>
+        <w:rPr>
+          <w:rFonts w:ascii="Arial" w:hAnsi="Arial" w:eastAsia="Arial"/>
+          <w:b w:val="0"/>
+          <w:i w:val="0"/>
+          <w:sz w:val="22"/>
+        </w:rPr>
+        <w:t xml:space="preserve">Mit </w:t>
+      </w:r>
+      <w:r>
+        <w:rPr>
+          <w:rFonts w:ascii="Consolas" w:hAnsi="Consolas" w:eastAsia="Consolas"/>
+          <w:b/>
+          <w:i w:val="0"/>
+          <w:color w:val="00344D"/>
+          <w:sz w:val="21"/>
+        </w:rPr>
+        <w:t>.index(wert)</w:t>
+      </w:r>
+      <w:r>
+        <w:rPr>
+          <w:rFonts w:ascii="Arial" w:hAnsi="Arial" w:eastAsia="Arial"/>
+          <w:b w:val="0"/>
+          <w:i w:val="0"/>
+          <w:sz w:val="22"/>
+        </w:rPr>
+        <w:t xml:space="preserve"> findest du die </w:t>
+      </w:r>
+      <w:r>
+        <w:rPr>
+          <w:rFonts w:ascii="Arial" w:hAnsi="Arial" w:eastAsia="Arial"/>
+          <w:b/>
+          <w:i w:val="0"/>
+          <w:color w:val="00344D"/>
+          <w:sz w:val="22"/>
+        </w:rPr>
+        <w:t>Position</w:t>
+      </w:r>
+      <w:r>
+        <w:rPr>
+          <w:rFonts w:ascii="Arial" w:hAnsi="Arial" w:eastAsia="Arial"/>
+          <w:b w:val="0"/>
+          <w:i w:val="0"/>
+          <w:sz w:val="22"/>
+        </w:rPr>
+        <w:t xml:space="preserve"> eines Werts (den Index des </w:t>
+      </w:r>
+      <w:r>
+        <w:rPr>
+          <w:rFonts w:ascii="Arial" w:hAnsi="Arial" w:eastAsia="Arial"/>
+          <w:b/>
+          <w:i w:val="0"/>
+          <w:color w:val="00344D"/>
+          <w:sz w:val="22"/>
+        </w:rPr>
+        <w:t>ersten</w:t>
+      </w:r>
+      <w:r>
+        <w:rPr>
+          <w:rFonts w:ascii="Arial" w:hAnsi="Arial" w:eastAsia="Arial"/>
+          <w:b w:val="0"/>
+          <w:i w:val="0"/>
+          <w:sz w:val="22"/>
+        </w:rPr>
+        <w:t xml:space="preserve"> Treffers) – ähnlich wie </w:t>
+      </w:r>
+      <w:r>
+        <w:rPr>
+          <w:rFonts w:ascii="Consolas" w:hAnsi="Consolas" w:eastAsia="Consolas"/>
+          <w:b w:val="0"/>
+          <w:i w:val="0"/>
+          <w:sz w:val="21"/>
+        </w:rPr>
+        <w:t>.find()</w:t>
+      </w:r>
+      <w:r>
+        <w:rPr>
+          <w:rFonts w:ascii="Arial" w:hAnsi="Arial" w:eastAsia="Arial"/>
+          <w:b w:val="0"/>
+          <w:i w:val="0"/>
+          <w:sz w:val="22"/>
+        </w:rPr>
+        <w:t xml:space="preserve"> bei Strings. Anders als </w:t>
+      </w:r>
+      <w:r>
+        <w:rPr>
+          <w:rFonts w:ascii="Consolas" w:hAnsi="Consolas" w:eastAsia="Consolas"/>
+          <w:b w:val="0"/>
+          <w:i w:val="0"/>
+          <w:sz w:val="21"/>
+        </w:rPr>
+        <w:t>.find()</w:t>
+      </w:r>
+      <w:r>
+        <w:rPr>
+          <w:rFonts w:ascii="Arial" w:hAnsi="Arial" w:eastAsia="Arial"/>
+          <w:b w:val="0"/>
+          <w:i w:val="0"/>
+          <w:sz w:val="22"/>
+        </w:rPr>
+        <w:t xml:space="preserve"> wirft </w:t>
+      </w:r>
+      <w:r>
+        <w:rPr>
+          <w:rFonts w:ascii="Consolas" w:hAnsi="Consolas" w:eastAsia="Consolas"/>
+          <w:b w:val="0"/>
+          <w:i w:val="0"/>
+          <w:sz w:val="21"/>
+        </w:rPr>
+        <w:t>.index()</w:t>
+      </w:r>
+      <w:r>
+        <w:rPr>
+          <w:rFonts w:ascii="Arial" w:hAnsi="Arial" w:eastAsia="Arial"/>
+          <w:b w:val="0"/>
+          <w:i w:val="0"/>
+          <w:sz w:val="22"/>
+        </w:rPr>
+        <w:t xml:space="preserve"> aber einen </w:t>
+      </w:r>
+      <w:r>
+        <w:rPr>
+          <w:rFonts w:ascii="Arial" w:hAnsi="Arial" w:eastAsia="Arial"/>
+          <w:b/>
+          <w:i w:val="0"/>
+          <w:color w:val="00344D"/>
+          <w:sz w:val="22"/>
+        </w:rPr>
+        <w:t>Fehler</w:t>
+      </w:r>
+      <w:r>
+        <w:rPr>
+          <w:rFonts w:ascii="Arial" w:hAnsi="Arial" w:eastAsia="Arial"/>
+          <w:b w:val="0"/>
+          <w:i w:val="0"/>
+          <w:sz w:val="22"/>
+        </w:rPr>
+        <w:t>, wenn der Wert nicht existiert.</w:t>
+      </w:r>
+    </w:p>
+    <w:p>
+      <w:pPr>
+        <w:spacing w:after="160"/>
+        <w:keepNext/>
+      </w:pPr>
+      <w:r>
+        <w:rPr>
+          <w:rFonts w:ascii="Arial" w:hAnsi="Arial" w:eastAsia="Arial"/>
+          <w:b w:val="0"/>
+          <w:i w:val="0"/>
+          <w:sz w:val="22"/>
+        </w:rPr>
+        <w:t>in prüft die Existenz, index() liefert die Position:</w:t>
+      </w:r>
+    </w:p>
+    <w:p>
+      <w:pPr>
+        <w:spacing w:after="40"/>
+        <w:keepNext/>
+      </w:pPr>
+      <w:r>
+        <w:rPr>
+          <w:rFonts w:ascii="Arial" w:hAnsi="Arial" w:eastAsia="Arial"/>
+          <w:b w:val="0"/>
+          <w:i/>
+          <w:color w:val="6E7B85"/>
+          <w:sz w:val="20"/>
+        </w:rPr>
+        <w:t>Beispiel</w:t>
+      </w:r>
+    </w:p>
+    <w:p>
+      <w:pPr>
+        <w:spacing w:after="200"/>
+        <w:shd w:val="clear" w:color="auto" w:fill="F2F5F7"/>
+      </w:pPr>
+      <w:r>
+        <w:rPr>
+          <w:rFonts w:ascii="Consolas" w:hAnsi="Consolas" w:eastAsia="Consolas"/>
+          <w:b w:val="0"/>
+          <w:i w:val="0"/>
+          <w:color w:val="00344D"/>
+          <w:sz w:val="21"/>
+        </w:rPr>
+        <w:t>tiere = ["Hund", "Katze", "Maus"]</w:t>
+      </w:r>
+      <w:r>
+        <w:br/>
+      </w:r>
+      <w:r>
+        <w:rPr>
+          <w:rFonts w:ascii="Consolas" w:hAnsi="Consolas" w:eastAsia="Consolas"/>
+          <w:b w:val="0"/>
+          <w:i w:val="0"/>
+          <w:color w:val="00344D"/>
+          <w:sz w:val="21"/>
+        </w:rPr>
+        <w:t>print("Katze" in tiere)</w:t>
+      </w:r>
+      <w:r>
+        <w:br/>
+      </w:r>
+      <w:r>
+        <w:rPr>
+          <w:rFonts w:ascii="Consolas" w:hAnsi="Consolas" w:eastAsia="Consolas"/>
+          <w:b w:val="0"/>
+          <w:i w:val="0"/>
+          <w:color w:val="00344D"/>
+          <w:sz w:val="21"/>
+        </w:rPr>
+        <w:t>print(tiere.index("Katze"))</w:t>
+      </w:r>
+    </w:p>
+    <w:p>
+      <w:pPr>
+        <w:spacing w:after="160"/>
+        <w:keepNext/>
+      </w:pPr>
+      <w:r>
+        <w:rPr>
+          <w:rFonts w:ascii="Arial" w:hAnsi="Arial" w:eastAsia="Arial"/>
+          <w:b w:val="0"/>
+          <w:i w:val="0"/>
+          <w:sz w:val="22"/>
+        </w:rPr>
+        <w:t xml:space="preserve">Mit </w:t>
+      </w:r>
+      <w:r>
+        <w:rPr>
+          <w:rFonts w:ascii="Consolas" w:hAnsi="Consolas" w:eastAsia="Consolas"/>
+          <w:b/>
+          <w:i w:val="0"/>
+          <w:color w:val="00344D"/>
+          <w:sz w:val="21"/>
+        </w:rPr>
+        <w:t>.count(wert)</w:t>
+      </w:r>
+      <w:r>
+        <w:rPr>
+          <w:rFonts w:ascii="Arial" w:hAnsi="Arial" w:eastAsia="Arial"/>
+          <w:b w:val="0"/>
+          <w:i w:val="0"/>
+          <w:sz w:val="22"/>
+        </w:rPr>
+        <w:t xml:space="preserve"> zählst du, </w:t>
+      </w:r>
+      <w:r>
+        <w:rPr>
+          <w:rFonts w:ascii="Arial" w:hAnsi="Arial" w:eastAsia="Arial"/>
+          <w:b/>
+          <w:i w:val="0"/>
+          <w:color w:val="00344D"/>
+          <w:sz w:val="22"/>
+        </w:rPr>
+        <w:t>wie oft</w:t>
+      </w:r>
+      <w:r>
+        <w:rPr>
+          <w:rFonts w:ascii="Arial" w:hAnsi="Arial" w:eastAsia="Arial"/>
+          <w:b w:val="0"/>
+          <w:i w:val="0"/>
+          <w:sz w:val="22"/>
+        </w:rPr>
+        <w:t xml:space="preserve"> ein Wert in der Liste vorkommt. Und mit </w:t>
+      </w:r>
+      <w:r>
+        <w:rPr>
+          <w:rFonts w:ascii="Consolas" w:hAnsi="Consolas" w:eastAsia="Consolas"/>
+          <w:b/>
+          <w:i w:val="0"/>
+          <w:color w:val="00344D"/>
+          <w:sz w:val="21"/>
+        </w:rPr>
+        <w:t>.remove(wert)</w:t>
+      </w:r>
+      <w:r>
+        <w:rPr>
+          <w:rFonts w:ascii="Arial" w:hAnsi="Arial" w:eastAsia="Arial"/>
+          <w:b w:val="0"/>
+          <w:i w:val="0"/>
+          <w:sz w:val="22"/>
+        </w:rPr>
+        <w:t xml:space="preserve"> entfernst du das </w:t>
+      </w:r>
+      <w:r>
+        <w:rPr>
+          <w:rFonts w:ascii="Arial" w:hAnsi="Arial" w:eastAsia="Arial"/>
+          <w:b/>
+          <w:i w:val="0"/>
+          <w:color w:val="00344D"/>
+          <w:sz w:val="22"/>
+        </w:rPr>
+        <w:t>erste</w:t>
+      </w:r>
+      <w:r>
+        <w:rPr>
+          <w:rFonts w:ascii="Arial" w:hAnsi="Arial" w:eastAsia="Arial"/>
+          <w:b w:val="0"/>
+          <w:i w:val="0"/>
+          <w:sz w:val="22"/>
+        </w:rPr>
+        <w:t xml:space="preserve"> Vorkommen eines Werts aus der Liste (die Liste wird dabei direkt verändert).</w:t>
+      </w:r>
+    </w:p>
+    <w:p>
+      <w:pPr>
+        <w:spacing w:after="160"/>
+        <w:keepNext/>
+      </w:pPr>
+      <w:r>
+        <w:rPr>
+          <w:rFonts w:ascii="Arial" w:hAnsi="Arial" w:eastAsia="Arial"/>
+          <w:b w:val="0"/>
+          <w:i w:val="0"/>
+          <w:sz w:val="22"/>
+        </w:rPr>
+        <w:t>count() zählt Vorkommen, remove() löscht das erste Vorkommen:</w:t>
+      </w:r>
+    </w:p>
+    <w:p>
+      <w:pPr>
+        <w:spacing w:after="40"/>
+        <w:keepNext/>
+      </w:pPr>
+      <w:r>
+        <w:rPr>
+          <w:rFonts w:ascii="Arial" w:hAnsi="Arial" w:eastAsia="Arial"/>
+          <w:b w:val="0"/>
+          <w:i/>
+          <w:color w:val="6E7B85"/>
+          <w:sz w:val="20"/>
+        </w:rPr>
+        <w:t>Beispiel</w:t>
+      </w:r>
+    </w:p>
+    <w:p>
+      <w:pPr>
+        <w:spacing w:after="200"/>
+        <w:shd w:val="clear" w:color="auto" w:fill="F2F5F7"/>
+      </w:pPr>
+      <w:r>
+        <w:rPr>
+          <w:rFonts w:ascii="Consolas" w:hAnsi="Consolas" w:eastAsia="Consolas"/>
+          <w:b w:val="0"/>
+          <w:i w:val="0"/>
+          <w:color w:val="00344D"/>
+          <w:sz w:val="21"/>
+        </w:rPr>
+        <w:t>zahlen = [3, 7, 3, 9, 3]</w:t>
+      </w:r>
+      <w:r>
+        <w:br/>
+      </w:r>
+      <w:r>
+        <w:rPr>
+          <w:rFonts w:ascii="Consolas" w:hAnsi="Consolas" w:eastAsia="Consolas"/>
+          <w:b w:val="0"/>
+          <w:i w:val="0"/>
+          <w:color w:val="00344D"/>
+          <w:sz w:val="21"/>
+        </w:rPr>
+        <w:t>print(zahlen.count(3))</w:t>
+      </w:r>
+      <w:r>
+        <w:br/>
+      </w:r>
+      <w:r>
+        <w:rPr>
+          <w:rFonts w:ascii="Consolas" w:hAnsi="Consolas" w:eastAsia="Consolas"/>
+          <w:b w:val="0"/>
+          <w:i w:val="0"/>
+          <w:color w:val="00344D"/>
+          <w:sz w:val="21"/>
+        </w:rPr>
+        <w:t>zahlen.remove(3)</w:t>
+      </w:r>
+      <w:r>
+        <w:br/>
+      </w:r>
+      <w:r>
+        <w:rPr>
+          <w:rFonts w:ascii="Consolas" w:hAnsi="Consolas" w:eastAsia="Consolas"/>
+          <w:b w:val="0"/>
+          <w:i w:val="0"/>
+          <w:color w:val="00344D"/>
+          <w:sz w:val="21"/>
+        </w:rPr>
+        <w:t>print(zahlen)</w:t>
+      </w:r>
+    </w:p>
+    <w:tbl>
+      <w:tblPr>
+        <w:tblW w:type="auto" w:w="0"/>
+        <w:tblLayout w:type="autofit"/>
+        <w:tblLook w:firstColumn="1" w:firstRow="1" w:lastColumn="0" w:lastRow="0" w:noHBand="0" w:noVBand="1" w:val="04A0"/>
+        <w:tblBorders>
+          <w:top w:val="single" w:sz="8" w:space="0" w:color="009FE3"/>
+          <w:left w:val="single" w:sz="8" w:space="0" w:color="009FE3"/>
+          <w:bottom w:val="single" w:sz="8" w:space="0" w:color="009FE3"/>
+          <w:right w:val="single" w:sz="8" w:space="0" w:color="009FE3"/>
+          <w:insideH w:val="single" w:sz="8" w:space="0" w:color="009FE3"/>
+          <w:insideV w:val="single" w:sz="8" w:space="0" w:color="009FE3"/>
+        </w:tblBorders>
+      </w:tblPr>
+      <w:tblGrid>
+        <w:gridCol w:w="9648"/>
+      </w:tblGrid>
+      <w:tr>
+        <w:trPr>
+          <w:cantSplit/>
+        </w:trPr>
+        <w:tc>
+          <w:tcPr>
+            <w:tcW w:type="dxa" w:w="9648"/>
+            <w:shd w:val="clear" w:color="auto" w:fill="EAF6FC"/>
+            <w:tcMar>
+              <w:top w:w="80" w:type="dxa"/>
+              <w:start w:w="120" w:type="dxa"/>
+              <w:bottom w:w="80" w:type="dxa"/>
+              <w:end w:w="120" w:type="dxa"/>
+            </w:tcMar>
+          </w:tcPr>
+          <w:p>
+            <w:r>
+              <w:rPr>
+                <w:rFonts w:ascii="Arial" w:hAnsi="Arial" w:eastAsia="Arial"/>
+                <w:b/>
+                <w:i w:val="0"/>
+                <w:color w:val="00344D"/>
+                <w:sz w:val="22"/>
+              </w:rPr>
+              <w:t xml:space="preserve">Aufgabe 9: </w:t>
+            </w:r>
+            <w:r>
+              <w:rPr>
+                <w:rFonts w:ascii="Arial" w:hAnsi="Arial" w:eastAsia="Arial"/>
+                <w:b/>
+                <w:i w:val="0"/>
+                <w:color w:val="00344D"/>
+                <w:sz w:val="22"/>
+              </w:rPr>
+              <w:t xml:space="preserve">Was macht </w:t>
+            </w:r>
+            <w:r>
+              <w:rPr>
+                <w:rFonts w:ascii="Consolas" w:hAnsi="Consolas" w:eastAsia="Consolas"/>
+                <w:b/>
+                <w:i w:val="0"/>
+                <w:color w:val="00344D"/>
+                <w:sz w:val="21"/>
+              </w:rPr>
+              <w:t>.remove(wert)</w:t>
+            </w:r>
+            <w:r>
+              <w:rPr>
+                <w:rFonts w:ascii="Arial" w:hAnsi="Arial" w:eastAsia="Arial"/>
+                <w:b/>
+                <w:i w:val="0"/>
+                <w:color w:val="00344D"/>
+                <w:sz w:val="22"/>
+              </w:rPr>
+              <w:t>, wenn der Wert mehrfach in der Liste vorkommt?</w:t>
+            </w:r>
+          </w:p>
+          <w:p/>
+          <w:p>
+            <w:r>
+              <w:rPr>
+                <w:rFonts w:ascii="Arial" w:hAnsi="Arial" w:eastAsia="Arial"/>
+                <w:b w:val="0"/>
+                <w:i w:val="0"/>
+                <w:sz w:val="22"/>
+              </w:rPr>
+              <w:t xml:space="preserve">☐  a)  </w:t>
+            </w:r>
+            <w:r>
+              <w:rPr>
+                <w:rFonts w:ascii="Arial" w:hAnsi="Arial" w:eastAsia="Arial"/>
+                <w:b w:val="0"/>
+                <w:i w:val="0"/>
+                <w:sz w:val="22"/>
+              </w:rPr>
+              <w:t>Entfernt alle Vorkommen</w:t>
+            </w:r>
+          </w:p>
+          <w:p>
+            <w:r>
+              <w:rPr>
+                <w:rFonts w:ascii="Arial" w:hAnsi="Arial" w:eastAsia="Arial"/>
+                <w:b w:val="0"/>
+                <w:i w:val="0"/>
+                <w:sz w:val="22"/>
+              </w:rPr>
+              <w:t xml:space="preserve">☐  b)  </w:t>
+            </w:r>
+            <w:r>
+              <w:rPr>
+                <w:rFonts w:ascii="Arial" w:hAnsi="Arial" w:eastAsia="Arial"/>
+                <w:b w:val="0"/>
+                <w:i w:val="0"/>
+                <w:sz w:val="22"/>
+              </w:rPr>
+              <w:t>Entfernt nur das erste Vorkommen</w:t>
+            </w:r>
+          </w:p>
+          <w:p>
+            <w:r>
+              <w:rPr>
+                <w:rFonts w:ascii="Arial" w:hAnsi="Arial" w:eastAsia="Arial"/>
+                <w:b w:val="0"/>
+                <w:i w:val="0"/>
+                <w:sz w:val="22"/>
+              </w:rPr>
+              <w:t xml:space="preserve">☐  c)  </w:t>
+            </w:r>
+            <w:r>
+              <w:rPr>
+                <w:rFonts w:ascii="Arial" w:hAnsi="Arial" w:eastAsia="Arial"/>
+                <w:b w:val="0"/>
+                <w:i w:val="0"/>
+                <w:sz w:val="22"/>
+              </w:rPr>
+              <w:t>Gibt einen Fehler zurück</w:t>
+            </w:r>
+          </w:p>
+        </w:tc>
+      </w:tr>
+    </w:tbl>
+    <w:tbl>
+      <w:tblPr>
+        <w:tblW w:type="auto" w:w="0"/>
+        <w:tblLayout w:type="autofit"/>
+        <w:tblLook w:firstColumn="1" w:firstRow="1" w:lastColumn="0" w:lastRow="0" w:noHBand="0" w:noVBand="1" w:val="04A0"/>
+        <w:tblBorders>
+          <w:top w:val="single" w:sz="8" w:space="0" w:color="009FE3"/>
+          <w:left w:val="single" w:sz="8" w:space="0" w:color="009FE3"/>
+          <w:bottom w:val="single" w:sz="8" w:space="0" w:color="009FE3"/>
+          <w:right w:val="single" w:sz="8" w:space="0" w:color="009FE3"/>
+          <w:insideH w:val="single" w:sz="8" w:space="0" w:color="009FE3"/>
+          <w:insideV w:val="single" w:sz="8" w:space="0" w:color="009FE3"/>
+        </w:tblBorders>
+      </w:tblPr>
+      <w:tblGrid>
+        <w:gridCol w:w="9648"/>
+      </w:tblGrid>
+      <w:tr>
+        <w:trPr>
+          <w:cantSplit/>
+        </w:trPr>
+        <w:tc>
+          <w:tcPr>
+            <w:tcW w:type="dxa" w:w="9648"/>
+            <w:shd w:val="clear" w:color="auto" w:fill="EAF6FC"/>
+            <w:tcMar>
+              <w:top w:w="80" w:type="dxa"/>
+              <w:start w:w="120" w:type="dxa"/>
+              <w:bottom w:w="80" w:type="dxa"/>
+              <w:end w:w="120" w:type="dxa"/>
+            </w:tcMar>
+          </w:tcPr>
+          <w:p>
+            <w:r>
+              <w:rPr>
+                <w:rFonts w:ascii="Arial" w:hAnsi="Arial" w:eastAsia="Arial"/>
+                <w:b/>
+                <w:i w:val="0"/>
+                <w:color w:val="00344D"/>
+                <w:sz w:val="22"/>
+              </w:rPr>
+              <w:t xml:space="preserve">Aufgabe 10: </w:t>
+            </w:r>
+            <w:r>
+              <w:rPr>
+                <w:rFonts w:ascii="Arial" w:hAnsi="Arial" w:eastAsia="Arial"/>
+                <w:b/>
+                <w:i w:val="0"/>
+                <w:color w:val="00344D"/>
+                <w:sz w:val="22"/>
+              </w:rPr>
+              <w:t xml:space="preserve">In </w:t>
+            </w:r>
+            <w:r>
+              <w:rPr>
+                <w:rFonts w:ascii="Consolas" w:hAnsi="Consolas" w:eastAsia="Consolas"/>
+                <w:b/>
+                <w:i w:val="0"/>
+                <w:color w:val="00344D"/>
+                <w:sz w:val="21"/>
+              </w:rPr>
+              <w:t>noten</w:t>
+            </w:r>
+            <w:r>
+              <w:rPr>
+                <w:rFonts w:ascii="Arial" w:hAnsi="Arial" w:eastAsia="Arial"/>
+                <w:b/>
+                <w:i w:val="0"/>
+                <w:color w:val="00344D"/>
+                <w:sz w:val="22"/>
+              </w:rPr>
+              <w:t xml:space="preserve"> steht eine Liste mit Schulnoten. Gib aus, wie oft die Note </w:t>
+            </w:r>
+            <w:r>
+              <w:rPr>
+                <w:rFonts w:ascii="Consolas" w:hAnsi="Consolas" w:eastAsia="Consolas"/>
+                <w:b/>
+                <w:i w:val="0"/>
+                <w:color w:val="00344D"/>
+                <w:sz w:val="21"/>
+              </w:rPr>
+              <w:t>3</w:t>
+            </w:r>
+            <w:r>
+              <w:rPr>
+                <w:rFonts w:ascii="Arial" w:hAnsi="Arial" w:eastAsia="Arial"/>
+                <w:b/>
+                <w:i w:val="0"/>
+                <w:color w:val="00344D"/>
+                <w:sz w:val="22"/>
+              </w:rPr>
+              <w:t xml:space="preserve"> vorkommt (</w:t>
+            </w:r>
+            <w:r>
+              <w:rPr>
+                <w:rFonts w:ascii="Consolas" w:hAnsi="Consolas" w:eastAsia="Consolas"/>
+                <w:b/>
+                <w:i w:val="0"/>
+                <w:color w:val="00344D"/>
+                <w:sz w:val="21"/>
+              </w:rPr>
+              <w:t>.count()</w:t>
+            </w:r>
+            <w:r>
+              <w:rPr>
+                <w:rFonts w:ascii="Arial" w:hAnsi="Arial" w:eastAsia="Arial"/>
+                <w:b/>
+                <w:i w:val="0"/>
+                <w:color w:val="00344D"/>
+                <w:sz w:val="22"/>
+              </w:rPr>
+              <w:t xml:space="preserve">). Entferne danach eine </w:t>
+            </w:r>
+            <w:r>
+              <w:rPr>
+                <w:rFonts w:ascii="Consolas" w:hAnsi="Consolas" w:eastAsia="Consolas"/>
+                <w:b/>
+                <w:i w:val="0"/>
+                <w:color w:val="00344D"/>
+                <w:sz w:val="21"/>
+              </w:rPr>
+              <w:t>5</w:t>
+            </w:r>
+            <w:r>
+              <w:rPr>
+                <w:rFonts w:ascii="Arial" w:hAnsi="Arial" w:eastAsia="Arial"/>
+                <w:b/>
+                <w:i w:val="0"/>
+                <w:color w:val="00344D"/>
+                <w:sz w:val="22"/>
+              </w:rPr>
+              <w:t xml:space="preserve"> mit </w:t>
+            </w:r>
+            <w:r>
+              <w:rPr>
+                <w:rFonts w:ascii="Consolas" w:hAnsi="Consolas" w:eastAsia="Consolas"/>
+                <w:b/>
+                <w:i w:val="0"/>
+                <w:color w:val="00344D"/>
+                <w:sz w:val="21"/>
+              </w:rPr>
+              <w:t>.remove()</w:t>
+            </w:r>
+            <w:r>
+              <w:rPr>
+                <w:rFonts w:ascii="Arial" w:hAnsi="Arial" w:eastAsia="Arial"/>
+                <w:b/>
+                <w:i w:val="0"/>
+                <w:color w:val="00344D"/>
+                <w:sz w:val="22"/>
+              </w:rPr>
+              <w:t xml:space="preserve"> und gib die komplette Liste aus.</w:t>
+            </w:r>
+          </w:p>
+          <w:p>
+            <w:r>
+              <w:rPr>
+                <w:rFonts w:ascii="Consolas" w:hAnsi="Consolas" w:eastAsia="Consolas"/>
+                <w:b w:val="0"/>
+                <w:i/>
+                <w:color w:val="6E7B85"/>
+                <w:sz w:val="20"/>
+              </w:rPr>
+              <w:t>noten = [2, 3, 5, 1, 3, 5, 4]</w:t>
+            </w:r>
+          </w:p>
+          <w:p>
+            <w:r>
+              <w:rPr>
+                <w:rFonts w:ascii="Arial" w:hAnsi="Arial" w:eastAsia="Arial"/>
+                <w:b w:val="0"/>
+                <w:i/>
+                <w:color w:val="6E7B85"/>
+                <w:sz w:val="19"/>
+              </w:rPr>
+              <w:t>Dein Code:</w:t>
+            </w:r>
+          </w:p>
+          <w:p/>
+          <w:p/>
+          <w:p/>
+        </w:tc>
+      </w:tr>
+    </w:tbl>
+    <w:p>
+      <w:pPr>
+        <w:spacing w:before="320" w:after="120"/>
+        <w:pBdr>
+          <w:bottom w:val="single" w:sz="8" w:space="4" w:color="009FE3"/>
+        </w:pBdr>
+        <w:keepNext/>
+      </w:pPr>
+      <w:r>
+        <w:rPr>
+          <w:rFonts w:ascii="Arial" w:hAnsi="Arial" w:eastAsia="Arial"/>
+          <w:b/>
+          <w:i w:val="0"/>
+          <w:color w:val="00344D"/>
+          <w:sz w:val="30"/>
+        </w:rPr>
+        <w:t>Listen anwenden</w:t>
+      </w:r>
+    </w:p>
+    <w:p>
+      <w:pPr>
+        <w:spacing w:after="160"/>
+        <w:keepNext/>
+      </w:pPr>
+      <w:r>
+        <w:rPr>
+          <w:rFonts w:ascii="Arial" w:hAnsi="Arial" w:eastAsia="Arial"/>
+          <w:b w:val="0"/>
+          <w:i w:val="0"/>
+          <w:sz w:val="22"/>
+        </w:rPr>
+        <w:t xml:space="preserve">Jetzt kombinierst du </w:t>
+      </w:r>
+      <w:r>
+        <w:rPr>
+          <w:rFonts w:ascii="Arial" w:hAnsi="Arial" w:eastAsia="Arial"/>
+          <w:b/>
+          <w:i w:val="0"/>
+          <w:color w:val="00344D"/>
+          <w:sz w:val="22"/>
+        </w:rPr>
+        <w:t>Listen</w:t>
+      </w:r>
+      <w:r>
+        <w:rPr>
+          <w:rFonts w:ascii="Arial" w:hAnsi="Arial" w:eastAsia="Arial"/>
+          <w:b w:val="0"/>
+          <w:i w:val="0"/>
+          <w:sz w:val="22"/>
+        </w:rPr>
+        <w:t xml:space="preserve"> mit der </w:t>
+      </w:r>
+      <w:r>
+        <w:rPr>
+          <w:rFonts w:ascii="Arial" w:hAnsi="Arial" w:eastAsia="Arial"/>
+          <w:b/>
+          <w:i w:val="0"/>
+          <w:color w:val="00344D"/>
+          <w:sz w:val="22"/>
+        </w:rPr>
+        <w:t>while-Schleife</w:t>
+      </w:r>
+      <w:r>
+        <w:rPr>
+          <w:rFonts w:ascii="Arial" w:hAnsi="Arial" w:eastAsia="Arial"/>
+          <w:b w:val="0"/>
+          <w:i w:val="0"/>
+          <w:sz w:val="22"/>
+        </w:rPr>
+        <w:t xml:space="preserve"> – genau wie in der letzten Lektion des Schleifen-Kapitels: eine Index-Variable </w:t>
+      </w:r>
+      <w:r>
+        <w:rPr>
+          <w:rFonts w:ascii="Consolas" w:hAnsi="Consolas" w:eastAsia="Consolas"/>
+          <w:b w:val="0"/>
+          <w:i w:val="0"/>
+          <w:sz w:val="21"/>
+        </w:rPr>
+        <w:t>i</w:t>
+      </w:r>
+      <w:r>
+        <w:rPr>
+          <w:rFonts w:ascii="Arial" w:hAnsi="Arial" w:eastAsia="Arial"/>
+          <w:b w:val="0"/>
+          <w:i w:val="0"/>
+          <w:sz w:val="22"/>
+        </w:rPr>
+        <w:t xml:space="preserve">, die Bedingung </w:t>
+      </w:r>
+      <w:r>
+        <w:rPr>
+          <w:rFonts w:ascii="Consolas" w:hAnsi="Consolas" w:eastAsia="Consolas"/>
+          <w:b w:val="0"/>
+          <w:i w:val="0"/>
+          <w:sz w:val="21"/>
+        </w:rPr>
+        <w:t>i &lt; len(liste)</w:t>
+      </w:r>
+      <w:r>
+        <w:rPr>
+          <w:rFonts w:ascii="Arial" w:hAnsi="Arial" w:eastAsia="Arial"/>
+          <w:b w:val="0"/>
+          <w:i w:val="0"/>
+          <w:sz w:val="22"/>
+        </w:rPr>
+        <w:t xml:space="preserve">, und Zugriff über </w:t>
+      </w:r>
+      <w:r>
+        <w:rPr>
+          <w:rFonts w:ascii="Consolas" w:hAnsi="Consolas" w:eastAsia="Consolas"/>
+          <w:b w:val="0"/>
+          <w:i w:val="0"/>
+          <w:sz w:val="21"/>
+        </w:rPr>
+        <w:t>liste[i]</w:t>
+      </w:r>
+      <w:r>
+        <w:rPr>
+          <w:rFonts w:ascii="Arial" w:hAnsi="Arial" w:eastAsia="Arial"/>
+          <w:b w:val="0"/>
+          <w:i w:val="0"/>
+          <w:sz w:val="22"/>
+        </w:rPr>
+        <w:t>.</w:t>
+      </w:r>
+    </w:p>
+    <w:p>
+      <w:pPr>
+        <w:spacing w:after="160"/>
+        <w:keepNext/>
+      </w:pPr>
+      <w:r>
+        <w:rPr>
+          <w:rFonts w:ascii="Arial" w:hAnsi="Arial" w:eastAsia="Arial"/>
+          <w:b w:val="0"/>
+          <w:i w:val="0"/>
+          <w:sz w:val="22"/>
+        </w:rPr>
+        <w:t xml:space="preserve">Aufgabe: In </w:t>
+      </w:r>
+      <w:r>
+        <w:rPr>
+          <w:rFonts w:ascii="Consolas" w:hAnsi="Consolas" w:eastAsia="Consolas"/>
+          <w:b w:val="0"/>
+          <w:i w:val="0"/>
+          <w:sz w:val="21"/>
+        </w:rPr>
+        <w:t>zahlen</w:t>
+      </w:r>
+      <w:r>
+        <w:rPr>
+          <w:rFonts w:ascii="Arial" w:hAnsi="Arial" w:eastAsia="Arial"/>
+          <w:b w:val="0"/>
+          <w:i w:val="0"/>
+          <w:sz w:val="22"/>
+        </w:rPr>
+        <w:t xml:space="preserve"> fehlt </w:t>
+      </w:r>
+      <w:r>
+        <w:rPr>
+          <w:rFonts w:ascii="Arial" w:hAnsi="Arial" w:eastAsia="Arial"/>
+          <w:b/>
+          <w:i w:val="0"/>
+          <w:color w:val="00344D"/>
+          <w:sz w:val="22"/>
+        </w:rPr>
+        <w:t>genau eine</w:t>
+      </w:r>
+      <w:r>
+        <w:rPr>
+          <w:rFonts w:ascii="Arial" w:hAnsi="Arial" w:eastAsia="Arial"/>
+          <w:b w:val="0"/>
+          <w:i w:val="0"/>
+          <w:sz w:val="22"/>
+        </w:rPr>
+        <w:t xml:space="preserve"> Zahl aus der Reihe 1 bis 10. Finde sie mit einem mathematischen Trick: Die </w:t>
+      </w:r>
+      <w:r>
+        <w:rPr>
+          <w:rFonts w:ascii="Arial" w:hAnsi="Arial" w:eastAsia="Arial"/>
+          <w:b/>
+          <w:i w:val="0"/>
+          <w:color w:val="00344D"/>
+          <w:sz w:val="22"/>
+        </w:rPr>
+        <w:t>Soll-Summe</w:t>
+      </w:r>
+      <w:r>
+        <w:rPr>
+          <w:rFonts w:ascii="Arial" w:hAnsi="Arial" w:eastAsia="Arial"/>
+          <w:b w:val="0"/>
+          <w:i w:val="0"/>
+          <w:sz w:val="22"/>
+        </w:rPr>
+        <w:t xml:space="preserve"> von 1 bis 10 lässt sich direkt berechnen (</w:t>
+      </w:r>
+      <w:r>
+        <w:rPr>
+          <w:rFonts w:ascii="Consolas" w:hAnsi="Consolas" w:eastAsia="Consolas"/>
+          <w:b w:val="0"/>
+          <w:i w:val="0"/>
+          <w:sz w:val="21"/>
+        </w:rPr>
+        <w:t>n * (n + 1) // 2</w:t>
+      </w:r>
+      <w:r>
+        <w:rPr>
+          <w:rFonts w:ascii="Arial" w:hAnsi="Arial" w:eastAsia="Arial"/>
+          <w:b w:val="0"/>
+          <w:i w:val="0"/>
+          <w:sz w:val="22"/>
+        </w:rPr>
+        <w:t xml:space="preserve">, mit n = 10). Die </w:t>
+      </w:r>
+      <w:r>
+        <w:rPr>
+          <w:rFonts w:ascii="Arial" w:hAnsi="Arial" w:eastAsia="Arial"/>
+          <w:b/>
+          <w:i w:val="0"/>
+          <w:color w:val="00344D"/>
+          <w:sz w:val="22"/>
+        </w:rPr>
+        <w:t>Ist-Summe</w:t>
+      </w:r>
+      <w:r>
+        <w:rPr>
+          <w:rFonts w:ascii="Arial" w:hAnsi="Arial" w:eastAsia="Arial"/>
+          <w:b w:val="0"/>
+          <w:i w:val="0"/>
+          <w:sz w:val="22"/>
+        </w:rPr>
+        <w:t xml:space="preserve"> bildest du selbst über die Liste. Die </w:t>
+      </w:r>
+      <w:r>
+        <w:rPr>
+          <w:rFonts w:ascii="Arial" w:hAnsi="Arial" w:eastAsia="Arial"/>
+          <w:b/>
+          <w:i w:val="0"/>
+          <w:color w:val="00344D"/>
+          <w:sz w:val="22"/>
+        </w:rPr>
+        <w:t>Differenz</w:t>
+      </w:r>
+      <w:r>
+        <w:rPr>
+          <w:rFonts w:ascii="Arial" w:hAnsi="Arial" w:eastAsia="Arial"/>
+          <w:b w:val="0"/>
+          <w:i w:val="0"/>
+          <w:sz w:val="22"/>
+        </w:rPr>
+        <w:t xml:space="preserve"> ist die fehlende Zahl!</w:t>
+      </w:r>
+    </w:p>
+    <w:p>
+      <w:pPr>
+        <w:spacing w:after="160"/>
+        <w:keepNext/>
+      </w:pPr>
+      <w:r>
+        <w:rPr>
+          <w:rFonts w:ascii="Arial" w:hAnsi="Arial" w:eastAsia="Arial"/>
+          <w:b w:val="0"/>
+          <w:i w:val="0"/>
+          <w:sz w:val="22"/>
+        </w:rPr>
+        <w:t>Soll-Summe direkt berechnet, Ist-Summe über die Liste aufsummiert:</w:t>
+      </w:r>
+    </w:p>
+    <w:p>
+      <w:pPr>
+        <w:spacing w:after="40"/>
+        <w:keepNext/>
+      </w:pPr>
+      <w:r>
+        <w:rPr>
+          <w:rFonts w:ascii="Arial" w:hAnsi="Arial" w:eastAsia="Arial"/>
+          <w:b w:val="0"/>
+          <w:i/>
+          <w:color w:val="6E7B85"/>
+          <w:sz w:val="20"/>
+        </w:rPr>
+        <w:t>Beispiel</w:t>
+      </w:r>
+    </w:p>
+    <w:p>
+      <w:pPr>
+        <w:spacing w:after="200"/>
+        <w:shd w:val="clear" w:color="auto" w:fill="F2F5F7"/>
+      </w:pPr>
+      <w:r>
+        <w:rPr>
+          <w:rFonts w:ascii="Consolas" w:hAnsi="Consolas" w:eastAsia="Consolas"/>
+          <w:b w:val="0"/>
+          <w:i w:val="0"/>
+          <w:color w:val="00344D"/>
+          <w:sz w:val="21"/>
+        </w:rPr>
+        <w:t>n = 5</w:t>
+      </w:r>
+      <w:r>
+        <w:br/>
+      </w:r>
+      <w:r>
+        <w:rPr>
+          <w:rFonts w:ascii="Consolas" w:hAnsi="Consolas" w:eastAsia="Consolas"/>
+          <w:b w:val="0"/>
+          <w:i w:val="0"/>
+          <w:color w:val="00344D"/>
+          <w:sz w:val="21"/>
+        </w:rPr>
+        <w:t>soll_summe = n * (n + 1) // 2</w:t>
+      </w:r>
+      <w:r>
+        <w:br/>
+      </w:r>
+      <w:r>
+        <w:rPr>
+          <w:rFonts w:ascii="Consolas" w:hAnsi="Consolas" w:eastAsia="Consolas"/>
+          <w:b w:val="0"/>
+          <w:i w:val="0"/>
+          <w:color w:val="00344D"/>
+          <w:sz w:val="21"/>
+        </w:rPr>
+        <w:t>print(soll_summe)</w:t>
+      </w:r>
+    </w:p>
+    <w:tbl>
+      <w:tblPr>
+        <w:tblW w:type="auto" w:w="0"/>
+        <w:tblLayout w:type="autofit"/>
+        <w:tblLook w:firstColumn="1" w:firstRow="1" w:lastColumn="0" w:lastRow="0" w:noHBand="0" w:noVBand="1" w:val="04A0"/>
+        <w:tblBorders>
+          <w:top w:val="single" w:sz="8" w:space="0" w:color="009FE3"/>
+          <w:left w:val="single" w:sz="8" w:space="0" w:color="009FE3"/>
+          <w:bottom w:val="single" w:sz="8" w:space="0" w:color="009FE3"/>
+          <w:right w:val="single" w:sz="8" w:space="0" w:color="009FE3"/>
+          <w:insideH w:val="single" w:sz="8" w:space="0" w:color="009FE3"/>
+          <w:insideV w:val="single" w:sz="8" w:space="0" w:color="009FE3"/>
+        </w:tblBorders>
+      </w:tblPr>
+      <w:tblGrid>
+        <w:gridCol w:w="9648"/>
+      </w:tblGrid>
+      <w:tr>
+        <w:trPr>
+          <w:cantSplit/>
+        </w:trPr>
+        <w:tc>
+          <w:tcPr>
+            <w:tcW w:type="dxa" w:w="9648"/>
+            <w:shd w:val="clear" w:color="auto" w:fill="EAF6FC"/>
+            <w:tcMar>
+              <w:top w:w="80" w:type="dxa"/>
+              <w:start w:w="120" w:type="dxa"/>
+              <w:bottom w:w="80" w:type="dxa"/>
+              <w:end w:w="120" w:type="dxa"/>
+            </w:tcMar>
+          </w:tcPr>
+          <w:p>
+            <w:r>
+              <w:rPr>
+                <w:rFonts w:ascii="Arial" w:hAnsi="Arial" w:eastAsia="Arial"/>
+                <w:b/>
+                <w:i w:val="0"/>
+                <w:color w:val="00344D"/>
+                <w:sz w:val="22"/>
+              </w:rPr>
+              <w:t xml:space="preserve">Aufgabe 11: </w:t>
+            </w:r>
+            <w:r>
+              <w:rPr>
+                <w:rFonts w:ascii="Arial" w:hAnsi="Arial" w:eastAsia="Arial"/>
+                <w:b/>
+                <w:i w:val="0"/>
+                <w:color w:val="00344D"/>
+                <w:sz w:val="22"/>
+              </w:rPr>
+              <w:t xml:space="preserve">In </w:t>
+            </w:r>
+            <w:r>
+              <w:rPr>
+                <w:rFonts w:ascii="Consolas" w:hAnsi="Consolas" w:eastAsia="Consolas"/>
+                <w:b/>
+                <w:i w:val="0"/>
+                <w:color w:val="00344D"/>
+                <w:sz w:val="21"/>
+              </w:rPr>
+              <w:t>zahlen</w:t>
+            </w:r>
+            <w:r>
+              <w:rPr>
+                <w:rFonts w:ascii="Arial" w:hAnsi="Arial" w:eastAsia="Arial"/>
+                <w:b/>
+                <w:i w:val="0"/>
+                <w:color w:val="00344D"/>
+                <w:sz w:val="22"/>
+              </w:rPr>
+              <w:t xml:space="preserve"> fehlt eine Zahl aus der Reihe 1 bis 10. Berechne: 1. </w:t>
+            </w:r>
+            <w:r>
+              <w:rPr>
+                <w:rFonts w:ascii="Consolas" w:hAnsi="Consolas" w:eastAsia="Consolas"/>
+                <w:b/>
+                <w:i w:val="0"/>
+                <w:color w:val="00344D"/>
+                <w:sz w:val="21"/>
+              </w:rPr>
+              <w:t>soll_summe</w:t>
+            </w:r>
+            <w:r>
+              <w:rPr>
+                <w:rFonts w:ascii="Arial" w:hAnsi="Arial" w:eastAsia="Arial"/>
+                <w:b/>
+                <w:i w:val="0"/>
+                <w:color w:val="00344D"/>
+                <w:sz w:val="22"/>
+              </w:rPr>
+              <w:t xml:space="preserve"> – die Summe von 1 bis 10, direkt mit der Formel </w:t>
+            </w:r>
+            <w:r>
+              <w:rPr>
+                <w:rFonts w:ascii="Consolas" w:hAnsi="Consolas" w:eastAsia="Consolas"/>
+                <w:b/>
+                <w:i w:val="0"/>
+                <w:color w:val="00344D"/>
+                <w:sz w:val="21"/>
+              </w:rPr>
+              <w:t>n * (n + 1) // 2</w:t>
+            </w:r>
+            <w:r>
+              <w:rPr>
+                <w:rFonts w:ascii="Arial" w:hAnsi="Arial" w:eastAsia="Arial"/>
+                <w:b/>
+                <w:i w:val="0"/>
+                <w:color w:val="00344D"/>
+                <w:sz w:val="22"/>
+              </w:rPr>
+              <w:t xml:space="preserve"> (n = 10) 2. </w:t>
+            </w:r>
+            <w:r>
+              <w:rPr>
+                <w:rFonts w:ascii="Consolas" w:hAnsi="Consolas" w:eastAsia="Consolas"/>
+                <w:b/>
+                <w:i w:val="0"/>
+                <w:color w:val="00344D"/>
+                <w:sz w:val="21"/>
+              </w:rPr>
+              <w:t>ist_summe</w:t>
+            </w:r>
+            <w:r>
+              <w:rPr>
+                <w:rFonts w:ascii="Arial" w:hAnsi="Arial" w:eastAsia="Arial"/>
+                <w:b/>
+                <w:i w:val="0"/>
+                <w:color w:val="00344D"/>
+                <w:sz w:val="22"/>
+              </w:rPr>
+              <w:t xml:space="preserve"> – die tatsächliche Summe der Liste, mit einer </w:t>
+            </w:r>
+            <w:r>
+              <w:rPr>
+                <w:rFonts w:ascii="Consolas" w:hAnsi="Consolas" w:eastAsia="Consolas"/>
+                <w:b/>
+                <w:i w:val="0"/>
+                <w:color w:val="00344D"/>
+                <w:sz w:val="21"/>
+              </w:rPr>
+              <w:t>while</w:t>
+            </w:r>
+            <w:r>
+              <w:rPr>
+                <w:rFonts w:ascii="Arial" w:hAnsi="Arial" w:eastAsia="Arial"/>
+                <w:b/>
+                <w:i w:val="0"/>
+                <w:color w:val="00344D"/>
+                <w:sz w:val="22"/>
+              </w:rPr>
+              <w:t xml:space="preserve">-Schleife und Index aufsummiert 3. </w:t>
+            </w:r>
+            <w:r>
+              <w:rPr>
+                <w:rFonts w:ascii="Consolas" w:hAnsi="Consolas" w:eastAsia="Consolas"/>
+                <w:b/>
+                <w:i w:val="0"/>
+                <w:color w:val="00344D"/>
+                <w:sz w:val="21"/>
+              </w:rPr>
+              <w:t>fehlende_zahl</w:t>
+            </w:r>
+            <w:r>
+              <w:rPr>
+                <w:rFonts w:ascii="Arial" w:hAnsi="Arial" w:eastAsia="Arial"/>
+                <w:b/>
+                <w:i w:val="0"/>
+                <w:color w:val="00344D"/>
+                <w:sz w:val="22"/>
+              </w:rPr>
+              <w:t xml:space="preserve"> – die Differenz </w:t>
+            </w:r>
+            <w:r>
+              <w:rPr>
+                <w:rFonts w:ascii="Consolas" w:hAnsi="Consolas" w:eastAsia="Consolas"/>
+                <w:b/>
+                <w:i w:val="0"/>
+                <w:color w:val="00344D"/>
+                <w:sz w:val="21"/>
+              </w:rPr>
+              <w:t>soll_summe - ist_summe</w:t>
+            </w:r>
+          </w:p>
+          <w:p>
+            <w:r>
+              <w:rPr>
+                <w:rFonts w:ascii="Arial" w:hAnsi="Arial" w:eastAsia="Arial"/>
+                <w:b w:val="0"/>
+                <w:i w:val="0"/>
+                <w:sz w:val="22"/>
+              </w:rPr>
+              <w:t xml:space="preserve">Gib am Ende nur </w:t>
+            </w:r>
+            <w:r>
+              <w:rPr>
+                <w:rFonts w:ascii="Consolas" w:hAnsi="Consolas" w:eastAsia="Consolas"/>
+                <w:b w:val="0"/>
+                <w:i w:val="0"/>
+                <w:sz w:val="21"/>
+              </w:rPr>
+              <w:t>fehlende_zahl</w:t>
+            </w:r>
+            <w:r>
+              <w:rPr>
+                <w:rFonts w:ascii="Arial" w:hAnsi="Arial" w:eastAsia="Arial"/>
+                <w:b w:val="0"/>
+                <w:i w:val="0"/>
+                <w:sz w:val="22"/>
+              </w:rPr>
+              <w:t xml:space="preserve"> aus.</w:t>
+            </w:r>
+          </w:p>
+          <w:p>
+            <w:r>
+              <w:rPr>
+                <w:rFonts w:ascii="Consolas" w:hAnsi="Consolas" w:eastAsia="Consolas"/>
+                <w:b w:val="0"/>
+                <w:i/>
+                <w:color w:val="6E7B85"/>
+                <w:sz w:val="20"/>
+              </w:rPr>
+              <w:t>zahlen = [1, 2, 4, 5, 6, 7, 8, 9, 10]</w:t>
+            </w:r>
+          </w:p>
+          <w:p>
+            <w:r>
+              <w:rPr>
+                <w:rFonts w:ascii="Arial" w:hAnsi="Arial" w:eastAsia="Arial"/>
+                <w:b w:val="0"/>
+                <w:i/>
+                <w:color w:val="6E7B85"/>
+                <w:sz w:val="19"/>
+              </w:rPr>
+              <w:t>Dein Code:</w:t>
+            </w:r>
+          </w:p>
+          <w:p/>
+          <w:p/>
+          <w:p/>
+        </w:tc>
+      </w:tr>
+    </w:tbl>
+    <w:p>
+      <w:pPr>
+        <w:spacing w:after="160"/>
+        <w:keepNext/>
+      </w:pPr>
+      <w:r>
+        <w:rPr>
+          <w:rFonts w:ascii="Arial" w:hAnsi="Arial" w:eastAsia="Arial"/>
+          <w:b w:val="0"/>
+          <w:i w:val="0"/>
+          <w:sz w:val="22"/>
+        </w:rPr>
+        <w:t xml:space="preserve">Ein weiterer typischer Einsatz: </w:t>
+      </w:r>
+      <w:r>
+        <w:rPr>
+          <w:rFonts w:ascii="Arial" w:hAnsi="Arial" w:eastAsia="Arial"/>
+          <w:b/>
+          <w:i w:val="0"/>
+          <w:color w:val="00344D"/>
+          <w:sz w:val="22"/>
+        </w:rPr>
+        <w:t>prüfen, ob es Duplikate gibt.</w:t>
+      </w:r>
+      <w:r>
+        <w:rPr>
+          <w:rFonts w:ascii="Arial" w:hAnsi="Arial" w:eastAsia="Arial"/>
+          <w:b w:val="0"/>
+          <w:i w:val="0"/>
+          <w:sz w:val="22"/>
+        </w:rPr>
+        <w:t xml:space="preserve"> Dafür baust du eine </w:t>
+      </w:r>
+      <w:r>
+        <w:rPr>
+          <w:rFonts w:ascii="Arial" w:hAnsi="Arial" w:eastAsia="Arial"/>
+          <w:b/>
+          <w:i w:val="0"/>
+          <w:color w:val="00344D"/>
+          <w:sz w:val="22"/>
+        </w:rPr>
+        <w:t>zweite, leere Liste</w:t>
+      </w:r>
+      <w:r>
+        <w:rPr>
+          <w:rFonts w:ascii="Arial" w:hAnsi="Arial" w:eastAsia="Arial"/>
+          <w:b w:val="0"/>
+          <w:i w:val="0"/>
+          <w:sz w:val="22"/>
+        </w:rPr>
+        <w:t xml:space="preserve"> auf – die „schon gesehen“-Liste. Für jedes Element prüfst du mit </w:t>
+      </w:r>
+      <w:r>
+        <w:rPr>
+          <w:rFonts w:ascii="Consolas" w:hAnsi="Consolas" w:eastAsia="Consolas"/>
+          <w:b w:val="0"/>
+          <w:i w:val="0"/>
+          <w:sz w:val="21"/>
+        </w:rPr>
+        <w:t>in</w:t>
+      </w:r>
+      <w:r>
+        <w:rPr>
+          <w:rFonts w:ascii="Arial" w:hAnsi="Arial" w:eastAsia="Arial"/>
+          <w:b w:val="0"/>
+          <w:i w:val="0"/>
+          <w:sz w:val="22"/>
+        </w:rPr>
+        <w:t xml:space="preserve">, ob es dort </w:t>
+      </w:r>
+      <w:r>
+        <w:rPr>
+          <w:rFonts w:ascii="Arial" w:hAnsi="Arial" w:eastAsia="Arial"/>
+          <w:b/>
+          <w:i w:val="0"/>
+          <w:color w:val="00344D"/>
+          <w:sz w:val="22"/>
+        </w:rPr>
+        <w:t>schon drin</w:t>
+      </w:r>
+      <w:r>
+        <w:rPr>
+          <w:rFonts w:ascii="Arial" w:hAnsi="Arial" w:eastAsia="Arial"/>
+          <w:b w:val="0"/>
+          <w:i w:val="0"/>
+          <w:sz w:val="22"/>
+        </w:rPr>
+        <w:t xml:space="preserve"> ist. Wenn ja, hast du ein Duplikat gefunden!</w:t>
+      </w:r>
+    </w:p>
+    <w:tbl>
+      <w:tblPr>
+        <w:tblW w:type="auto" w:w="0"/>
+        <w:tblLayout w:type="autofit"/>
+        <w:tblLook w:firstColumn="1" w:firstRow="1" w:lastColumn="0" w:lastRow="0" w:noHBand="0" w:noVBand="1" w:val="04A0"/>
+        <w:tblBorders>
+          <w:top w:val="single" w:sz="8" w:space="0" w:color="009FE3"/>
+          <w:left w:val="single" w:sz="8" w:space="0" w:color="009FE3"/>
+          <w:bottom w:val="single" w:sz="8" w:space="0" w:color="009FE3"/>
+          <w:right w:val="single" w:sz="8" w:space="0" w:color="009FE3"/>
+          <w:insideH w:val="single" w:sz="8" w:space="0" w:color="009FE3"/>
+          <w:insideV w:val="single" w:sz="8" w:space="0" w:color="009FE3"/>
+        </w:tblBorders>
+      </w:tblPr>
+      <w:tblGrid>
+        <w:gridCol w:w="9648"/>
+      </w:tblGrid>
+      <w:tr>
+        <w:trPr>
+          <w:cantSplit/>
+        </w:trPr>
+        <w:tc>
+          <w:tcPr>
+            <w:tcW w:type="dxa" w:w="9648"/>
+            <w:shd w:val="clear" w:color="auto" w:fill="EAF6FC"/>
+            <w:tcMar>
+              <w:top w:w="80" w:type="dxa"/>
+              <w:start w:w="120" w:type="dxa"/>
+              <w:bottom w:w="80" w:type="dxa"/>
+              <w:end w:w="120" w:type="dxa"/>
+            </w:tcMar>
+          </w:tcPr>
+          <w:p>
+            <w:r>
+              <w:rPr>
+                <w:rFonts w:ascii="Arial" w:hAnsi="Arial" w:eastAsia="Arial"/>
+                <w:b/>
+                <w:i w:val="0"/>
+                <w:color w:val="00344D"/>
+                <w:sz w:val="22"/>
+              </w:rPr>
+              <w:t xml:space="preserve">Aufgabe 12: </w:t>
+            </w:r>
+            <w:r>
+              <w:rPr>
+                <w:rFonts w:ascii="Arial" w:hAnsi="Arial" w:eastAsia="Arial"/>
+                <w:b/>
+                <w:i w:val="0"/>
+                <w:color w:val="00344D"/>
+                <w:sz w:val="22"/>
+              </w:rPr>
+              <w:t xml:space="preserve">In </w:t>
+            </w:r>
+            <w:r>
+              <w:rPr>
+                <w:rFonts w:ascii="Consolas" w:hAnsi="Consolas" w:eastAsia="Consolas"/>
+                <w:b/>
+                <w:i w:val="0"/>
+                <w:color w:val="00344D"/>
+                <w:sz w:val="21"/>
+              </w:rPr>
+              <w:t>zahlen</w:t>
+            </w:r>
+            <w:r>
+              <w:rPr>
+                <w:rFonts w:ascii="Arial" w:hAnsi="Arial" w:eastAsia="Arial"/>
+                <w:b/>
+                <w:i w:val="0"/>
+                <w:color w:val="00344D"/>
+                <w:sz w:val="22"/>
+              </w:rPr>
+              <w:t xml:space="preserve"> steht eine Liste mit genau einer doppelten Zahl. Finde sie: Lege eine leere Liste </w:t>
+            </w:r>
+            <w:r>
+              <w:rPr>
+                <w:rFonts w:ascii="Consolas" w:hAnsi="Consolas" w:eastAsia="Consolas"/>
+                <w:b/>
+                <w:i w:val="0"/>
+                <w:color w:val="00344D"/>
+                <w:sz w:val="21"/>
+              </w:rPr>
+              <w:t>gesehen = []</w:t>
+            </w:r>
+            <w:r>
+              <w:rPr>
+                <w:rFonts w:ascii="Arial" w:hAnsi="Arial" w:eastAsia="Arial"/>
+                <w:b/>
+                <w:i w:val="0"/>
+                <w:color w:val="00344D"/>
+                <w:sz w:val="22"/>
+              </w:rPr>
+              <w:t xml:space="preserve"> an. Durchlaufe </w:t>
+            </w:r>
+            <w:r>
+              <w:rPr>
+                <w:rFonts w:ascii="Consolas" w:hAnsi="Consolas" w:eastAsia="Consolas"/>
+                <w:b/>
+                <w:i w:val="0"/>
+                <w:color w:val="00344D"/>
+                <w:sz w:val="21"/>
+              </w:rPr>
+              <w:t>zahlen</w:t>
+            </w:r>
+            <w:r>
+              <w:rPr>
+                <w:rFonts w:ascii="Arial" w:hAnsi="Arial" w:eastAsia="Arial"/>
+                <w:b/>
+                <w:i w:val="0"/>
+                <w:color w:val="00344D"/>
+                <w:sz w:val="22"/>
+              </w:rPr>
+              <w:t xml:space="preserve"> mit </w:t>
+            </w:r>
+            <w:r>
+              <w:rPr>
+                <w:rFonts w:ascii="Consolas" w:hAnsi="Consolas" w:eastAsia="Consolas"/>
+                <w:b/>
+                <w:i w:val="0"/>
+                <w:color w:val="00344D"/>
+                <w:sz w:val="21"/>
+              </w:rPr>
+              <w:t>while</w:t>
+            </w:r>
+            <w:r>
+              <w:rPr>
+                <w:rFonts w:ascii="Arial" w:hAnsi="Arial" w:eastAsia="Arial"/>
+                <w:b/>
+                <w:i w:val="0"/>
+                <w:color w:val="00344D"/>
+                <w:sz w:val="22"/>
+              </w:rPr>
+              <w:t xml:space="preserve"> und Index. Ist das aktuelle Element bereits in </w:t>
+            </w:r>
+            <w:r>
+              <w:rPr>
+                <w:rFonts w:ascii="Consolas" w:hAnsi="Consolas" w:eastAsia="Consolas"/>
+                <w:b/>
+                <w:i w:val="0"/>
+                <w:color w:val="00344D"/>
+                <w:sz w:val="21"/>
+              </w:rPr>
+              <w:t>gesehen</w:t>
+            </w:r>
+            <w:r>
+              <w:rPr>
+                <w:rFonts w:ascii="Arial" w:hAnsi="Arial" w:eastAsia="Arial"/>
+                <w:b/>
+                <w:i w:val="0"/>
+                <w:color w:val="00344D"/>
+                <w:sz w:val="22"/>
+              </w:rPr>
+              <w:t xml:space="preserve">, gib es aus und beende die Schleife mit </w:t>
+            </w:r>
+            <w:r>
+              <w:rPr>
+                <w:rFonts w:ascii="Consolas" w:hAnsi="Consolas" w:eastAsia="Consolas"/>
+                <w:b/>
+                <w:i w:val="0"/>
+                <w:color w:val="00344D"/>
+                <w:sz w:val="21"/>
+              </w:rPr>
+              <w:t>break</w:t>
+            </w:r>
+            <w:r>
+              <w:rPr>
+                <w:rFonts w:ascii="Arial" w:hAnsi="Arial" w:eastAsia="Arial"/>
+                <w:b/>
+                <w:i w:val="0"/>
+                <w:color w:val="00344D"/>
+                <w:sz w:val="22"/>
+              </w:rPr>
+              <w:t xml:space="preserve">. Sonst füge es mit </w:t>
+            </w:r>
+            <w:r>
+              <w:rPr>
+                <w:rFonts w:ascii="Consolas" w:hAnsi="Consolas" w:eastAsia="Consolas"/>
+                <w:b/>
+                <w:i w:val="0"/>
+                <w:color w:val="00344D"/>
+                <w:sz w:val="21"/>
+              </w:rPr>
+              <w:t>.append()</w:t>
+            </w:r>
+            <w:r>
+              <w:rPr>
+                <w:rFonts w:ascii="Arial" w:hAnsi="Arial" w:eastAsia="Arial"/>
+                <w:b/>
+                <w:i w:val="0"/>
+                <w:color w:val="00344D"/>
+                <w:sz w:val="22"/>
+              </w:rPr>
+              <w:t xml:space="preserve"> zu </w:t>
+            </w:r>
+            <w:r>
+              <w:rPr>
+                <w:rFonts w:ascii="Consolas" w:hAnsi="Consolas" w:eastAsia="Consolas"/>
+                <w:b/>
+                <w:i w:val="0"/>
+                <w:color w:val="00344D"/>
+                <w:sz w:val="21"/>
+              </w:rPr>
+              <w:t>gesehen</w:t>
+            </w:r>
+            <w:r>
+              <w:rPr>
+                <w:rFonts w:ascii="Arial" w:hAnsi="Arial" w:eastAsia="Arial"/>
+                <w:b/>
+                <w:i w:val="0"/>
+                <w:color w:val="00344D"/>
+                <w:sz w:val="22"/>
+              </w:rPr>
+              <w:t xml:space="preserve"> hinzu.</w:t>
+            </w:r>
+          </w:p>
+          <w:p>
+            <w:r>
+              <w:rPr>
+                <w:rFonts w:ascii="Consolas" w:hAnsi="Consolas" w:eastAsia="Consolas"/>
+                <w:b w:val="0"/>
+                <w:i/>
+                <w:color w:val="6E7B85"/>
+                <w:sz w:val="20"/>
+              </w:rPr>
+              <w:t>zahlen = [4, 8, 15, 16, 23, 8, 42]</w:t>
+            </w:r>
+          </w:p>
+          <w:p>
+            <w:r>
+              <w:rPr>
+                <w:rFonts w:ascii="Arial" w:hAnsi="Arial" w:eastAsia="Arial"/>
+                <w:b w:val="0"/>
+                <w:i/>
+                <w:color w:val="6E7B85"/>
+                <w:sz w:val="19"/>
+              </w:rPr>
+              <w:t>Dein Code:</w:t>
+            </w:r>
+          </w:p>
+          <w:p/>
+          <w:p/>
+          <w:p/>
+        </w:tc>
+      </w:tr>
+    </w:tbl>
     <w:sectPr>
       <w:headerReference w:type="default" r:id="rId9"/>
       <w:footerReference w:type="default" r:id="rId10"/>

</xml_diff>